<commit_message>
Regenerate docx/pdf/sources-log from v5; record revision in brief
Rebuilds the .docx and .pdf to match the HTML already updated in the
prior commit, and rewrites the sources log: drops the 6 removed
market-research citations, adds Sugar Sell, Sugar Serve and Nucleus
Research (with a verified/search-snippet-only column), keeps the FAQ
7 rebrand source renumbered to 1. Also appends brief.md Section 11
documenting the full post-delivery revision (why the stats bands
changed, sources used, and known limitations), so the brief stays
the authoritative record of what shipped and why.

Co-Authored-By: Claude Sonnet 5 <noreply@anthropic.com>
Claude-Session: https://claude.ai/code/session_01JX9jUeMXo5BjnNTgQc8zQL
</commit_message>
<xml_diff>
--- a/content-pipeline/requirements/2026-09-23-sugarai-field-service-management-subpage/output/sugarai-field-service-management.docx
+++ b/content-pipeline/requirements/2026-09-23-sugarai-field-service-management-subpage/output/sugarai-field-service-management.docx
@@ -533,7 +533,6 @@
     <w:p>
       <w:pPr>
         <w:pStyle w:val="Lede"/>
-        <w:keepNext w:val="false"/>
       </w:pPr>
       <w:r>
         <w:t xml:space="preserve">SugarAI for Field Service Management gives your service desk, dispatchers and technicians one record of customer, site, equipment and contract, so jobs reach the right person and close with evidence attached. Whether it runs in the cloud or on your own servers, HLB HAMT configures it for service businesses throughout the UAE and GCC.</w:t>
@@ -567,6 +566,7 @@
     <w:p>
       <w:pPr>
         <w:pStyle w:val="Body"/>
+        <w:keepNext/>
       </w:pPr>
       <w:r>
         <w:t xml:space="preserve">Set up for annual maintenance contracts (AMCs), multi-site customers and mixed in-house and subcontracted crews.</w:t>
@@ -818,7 +818,7 @@
         <w:keepNext/>
       </w:pPr>
       <w:r>
-        <w:t xml:space="preserve">Gulf demand for maintained buildings, plant and infrastructure keeps growing, as the market figures below show. Tailored by HLB HAMT, SugarAI works as field service CRM software, giving sales, service and field teams one shared record with AI built in.</w:t>
+        <w:t xml:space="preserve">Tailored by HLB HAMT, SugarAI works as field service CRM software, giving sales, service and field teams one shared record with AI built in. SugarCRM publishes the figures below for Sugar Sell, its sales module. They span that module's whole customer base, not field service specifically.</w:t>
       </w:r>
     </w:p>
     <w:tbl>
@@ -949,7 +949,7 @@
                 <w:sz w:val="24"/>
                 <w:szCs w:val="24"/>
               </w:rPr>
-              <w:t xml:space="preserve">US$809.8M</w:t>
+              <w:t xml:space="preserve">+23%</w:t>
             </w:r>
           </w:p>
         </w:tc>
@@ -973,7 +973,7 @@
                 <w:b/>
                 <w:bCs/>
               </w:rPr>
-              <w:t xml:space="preserve">Regional field service market</w:t>
+              <w:t xml:space="preserve">Increased revenue</w:t>
             </w:r>
           </w:p>
         </w:tc>
@@ -993,14 +993,7 @@
               <w:keepNext/>
             </w:pPr>
             <w:r>
-              <w:t xml:space="preserve">Middle East and Africa field service management revenue in 2025, forecast to grow 8.3% yearly to 2033.</w:t>
-            </w:r>
-            <w:r>
-              <w:rPr>
-                <w:color w:val="576B7D"/>
-                <w:vertAlign w:val="superscript"/>
-              </w:rPr>
-              <w:t xml:space="preserve">[1]</w:t>
+              <w:t xml:space="preserve">Sugar Sell customers grew revenue by this margin. Configured for field service, Sugar Sell turns repairs spotted on site into quotes.</w:t>
             </w:r>
           </w:p>
         </w:tc>
@@ -1032,7 +1025,7 @@
                 <w:sz w:val="24"/>
                 <w:szCs w:val="24"/>
               </w:rPr>
-              <w:t xml:space="preserve">US$70.25B</w:t>
+              <w:t xml:space="preserve">+30%</w:t>
             </w:r>
           </w:p>
         </w:tc>
@@ -1056,7 +1049,7 @@
                 <w:b/>
                 <w:bCs/>
               </w:rPr>
-              <w:t xml:space="preserve">GCC facilities management, 2025</w:t>
+              <w:t xml:space="preserve">Improved win rate</w:t>
             </w:r>
           </w:p>
         </w:tc>
@@ -1076,14 +1069,7 @@
               <w:keepNext/>
             </w:pPr>
             <w:r>
-              <w:t xml:space="preserve">Hard services, led by MEP and HVAC maintenance, hold the largest share of this market.</w:t>
-            </w:r>
-            <w:r>
-              <w:rPr>
-                <w:color w:val="576B7D"/>
-                <w:vertAlign w:val="superscript"/>
-              </w:rPr>
-              <w:t xml:space="preserve">[2]</w:t>
+              <w:t xml:space="preserve">Win rates rose across that customer group. AMC and warranty proposals follow the same quote-to-close stages.</w:t>
             </w:r>
           </w:p>
         </w:tc>
@@ -1115,7 +1101,7 @@
                 <w:sz w:val="24"/>
                 <w:szCs w:val="24"/>
               </w:rPr>
-              <w:t xml:space="preserve">64.88%</w:t>
+              <w:t xml:space="preserve">3×</w:t>
             </w:r>
           </w:p>
         </w:tc>
@@ -1139,7 +1125,7 @@
                 <w:b/>
                 <w:bCs/>
               </w:rPr>
-              <w:t xml:space="preserve">Outsourced FM in the UAE</w:t>
+              <w:t xml:space="preserve">Pipeline volume</w:t>
             </w:r>
           </w:p>
         </w:tc>
@@ -1159,14 +1145,7 @@
               <w:keepNext w:val="false"/>
             </w:pPr>
             <w:r>
-              <w:t xml:space="preserve">Share of UAE facility management delivered by outsourced providers in 2025.</w:t>
-            </w:r>
-            <w:r>
-              <w:rPr>
-                <w:color w:val="576B7D"/>
-                <w:vertAlign w:val="superscript"/>
-              </w:rPr>
-              <w:t xml:space="preserve">[3]</w:t>
+              <w:t xml:space="preserve">Pipelines tripled in volume for those customers. Contract renewals join the pipeline well before they fall due, alongside new business.</w:t>
             </w:r>
           </w:p>
         </w:tc>
@@ -1174,76 +1153,8 @@
     </w:tbl>
     <w:p>
       <w:pPr>
-        <w:pStyle w:val="SourceHead"/>
-        <w:keepNext/>
-      </w:pPr>
-      <w:r>
-        <w:t xml:space="preserve">Sources</w:t>
-      </w:r>
-    </w:p>
-    <w:p>
-      <w:pPr>
-        <w:pStyle w:val="SourceText"/>
-        <w:numPr>
-          <w:ilvl w:val="0"/>
-          <w:numId w:val="2"/>
-        </w:numPr>
-      </w:pPr>
-      <w:r>
-        <w:t xml:space="preserve">Grand View Research, Middle East and Africa field service management market outlook: </w:t>
-      </w:r>
-      <w:hyperlink w:history="1" r:id="rIdxwd1vxqipqkujryv7v9ct">
-        <w:r>
-          <w:rPr>
-            <w:rStyle w:val="Hyperlink"/>
-          </w:rPr>
-          <w:t xml:space="preserve">https://www.grandviewresearch.com/horizon/outlook/field-service-management-market/mea</w:t>
-        </w:r>
-      </w:hyperlink>
-    </w:p>
-    <w:p>
-      <w:pPr>
-        <w:pStyle w:val="SourceText"/>
-        <w:numPr>
-          <w:ilvl w:val="0"/>
-          <w:numId w:val="2"/>
-        </w:numPr>
-      </w:pPr>
-      <w:r>
-        <w:t xml:space="preserve">Mordor Intelligence, GCC facility management market: </w:t>
-      </w:r>
-      <w:hyperlink w:history="1" r:id="rIdjnbe3ky7jvnyxi00nyu_h">
-        <w:r>
-          <w:rPr>
-            <w:rStyle w:val="Hyperlink"/>
-          </w:rPr>
-          <w:t xml:space="preserve">https://www.mordorintelligence.com/industry-reports/gcc-facility-management-market</w:t>
-        </w:r>
-      </w:hyperlink>
-    </w:p>
-    <w:p>
-      <w:pPr>
-        <w:pStyle w:val="SourceText"/>
-        <w:numPr>
-          <w:ilvl w:val="0"/>
-          <w:numId w:val="2"/>
-        </w:numPr>
-      </w:pPr>
-      <w:r>
-        <w:t xml:space="preserve">Mordor Intelligence, UAE facility management market: </w:t>
-      </w:r>
-      <w:hyperlink w:history="1" r:id="rId0ek1jj2jncnleqvditgag">
-        <w:r>
-          <w:rPr>
-            <w:rStyle w:val="Hyperlink"/>
-          </w:rPr>
-          <w:t xml:space="preserve">https://www.mordorintelligence.com/industry-reports/uae-facility-management-market</w:t>
-        </w:r>
-      </w:hyperlink>
-    </w:p>
-    <w:p>
-      <w:pPr>
         <w:pStyle w:val="Eyebrow"/>
+        <w:pageBreakBefore/>
       </w:pPr>
       <w:r>
         <w:t xml:space="preserve">The platform</w:t>
@@ -1262,12 +1173,12 @@
     <w:p>
       <w:pPr>
         <w:pStyle w:val="Lede"/>
-        <w:keepNext w:val="false"/>
+        <w:keepNext/>
       </w:pPr>
       <w:r>
         <w:t xml:space="preserve">HLB HAMT delivers SugarAI for Field Service Management by configuring core SugarAI, with no bolt-on product. The Time-Aware Customer Data Platform beneath all </w:t>
       </w:r>
-      <w:hyperlink w:history="1" r:id="rIdl-moajos8rtujhdpzymg9">
+      <w:hyperlink w:history="1" r:id="rIdujfv0sukcb2r4hcvwzf8w">
         <w:r>
           <w:rPr>
             <w:rStyle w:val="Hyperlink"/>
@@ -1408,7 +1319,6 @@
     <w:p>
       <w:pPr>
         <w:pStyle w:val="Lede"/>
-        <w:keepNext w:val="false"/>
       </w:pPr>
       <w:r>
         <w:t xml:space="preserve">In SugarAI for Field Service Management, these six capabilities carry each job from the first request to the customer's sign-off.</w:t>
@@ -1584,7 +1494,6 @@
     <w:p>
       <w:pPr>
         <w:pStyle w:val="Lede"/>
-        <w:keepNext w:val="false"/>
       </w:pPr>
       <w:r>
         <w:t xml:space="preserve">One HLB HAMT team takes you from design to the screens technicians use each morning.</w:t>
@@ -1603,7 +1512,7 @@
         <w:t xml:space="preserve">01</w:t>
       </w:r>
       <w:r>
-        <w:tab/>
+        <w:t xml:space="preserve">	</w:t>
       </w:r>
       <w:r>
         <w:t xml:space="preserve">SugarAI field service implementation</w:t>
@@ -1630,7 +1539,7 @@
         <w:t xml:space="preserve">02</w:t>
       </w:r>
       <w:r>
-        <w:tab/>
+        <w:t xml:space="preserve">	</w:t>
       </w:r>
       <w:r>
         <w:t xml:space="preserve">Job types, checklists and dynamic forms</w:t>
@@ -1657,7 +1566,7 @@
         <w:t xml:space="preserve">03</w:t>
       </w:r>
       <w:r>
-        <w:tab/>
+        <w:t xml:space="preserve">	</w:t>
       </w:r>
       <w:r>
         <w:t xml:space="preserve">Customer and subcontractor portals</w:t>
@@ -1684,7 +1593,7 @@
         <w:t xml:space="preserve">04</w:t>
       </w:r>
       <w:r>
-        <w:tab/>
+        <w:t xml:space="preserve">	</w:t>
       </w:r>
       <w:r>
         <w:t xml:space="preserve">ERP, inventory and billing integration</w:t>
@@ -1711,7 +1620,7 @@
         <w:t xml:space="preserve">05</w:t>
       </w:r>
       <w:r>
-        <w:tab/>
+        <w:t xml:space="preserve">	</w:t>
       </w:r>
       <w:r>
         <w:t xml:space="preserve">Case-to-work-order flow with SLA escalation</w:t>
@@ -1738,7 +1647,7 @@
         <w:t xml:space="preserve">06</w:t>
       </w:r>
       <w:r>
-        <w:tab/>
+        <w:t xml:space="preserve">	</w:t>
       </w:r>
       <w:r>
         <w:t xml:space="preserve">Preventive maintenance and AMC renewals</w:t>
@@ -1765,7 +1674,7 @@
         <w:t xml:space="preserve">07</w:t>
       </w:r>
       <w:r>
-        <w:tab/>
+        <w:t xml:space="preserve">	</w:t>
       </w:r>
       <w:r>
         <w:t xml:space="preserve">Field service dashboards and KPIs</w:t>
@@ -1792,7 +1701,7 @@
         <w:t xml:space="preserve">08</w:t>
       </w:r>
       <w:r>
-        <w:tab/>
+        <w:t xml:space="preserve">	</w:t>
       </w:r>
       <w:r>
         <w:t xml:space="preserve">Mobile field service management</w:t>
@@ -1821,7 +1730,7 @@
         <w:keepLines/>
       </w:pPr>
       <w:r>
-        <w:t xml:space="preserve">What well-run field service operations achieve</w:t>
+        <w:t xml:space="preserve">What the service desk and ERP layers deliver</w:t>
       </w:r>
     </w:p>
     <w:p>
@@ -1830,7 +1739,7 @@
         <w:keepNext/>
       </w:pPr>
       <w:r>
-        <w:t xml:space="preserve">These industry benchmarks show what leading service organisations achieve, alongside market data on software spending and UAE mobile networks. Our projects are designed around them.</w:t>
+        <w:t xml:space="preserve">The first two figures are SugarCRM's own numbers for Sugar Serve, its customer service module. The third is analyst research on Sugar's ERP integration.</w:t>
       </w:r>
     </w:p>
     <w:tbl>
@@ -1934,7 +1843,7 @@
                 <w:sz w:val="24"/>
                 <w:szCs w:val="24"/>
               </w:rPr>
-              <w:t xml:space="preserve">86%</w:t>
+              <w:t xml:space="preserve">-27%</w:t>
             </w:r>
           </w:p>
         </w:tc>
@@ -1954,14 +1863,7 @@
               <w:keepNext/>
             </w:pPr>
             <w:r>
-              <w:t xml:space="preserve">First-time fix rate at top-performing service organisations</w:t>
-            </w:r>
-            <w:r>
-              <w:rPr>
-                <w:color w:val="576B7D"/>
-                <w:vertAlign w:val="superscript"/>
-              </w:rPr>
-              <w:t xml:space="preserve">[4]</w:t>
+              <w:t xml:space="preserve">Reduced case error rate</w:t>
             </w:r>
           </w:p>
         </w:tc>
@@ -1993,7 +1895,7 @@
                 <w:sz w:val="24"/>
                 <w:szCs w:val="24"/>
               </w:rPr>
-              <w:t xml:space="preserve">39%</w:t>
+              <w:t xml:space="preserve">+30%</w:t>
             </w:r>
           </w:p>
         </w:tc>
@@ -2013,14 +1915,7 @@
               <w:keepNext/>
             </w:pPr>
             <w:r>
-              <w:t xml:space="preserve">Faster resolution for top performers using AI</w:t>
-            </w:r>
-            <w:r>
-              <w:rPr>
-                <w:color w:val="576B7D"/>
-                <w:vertAlign w:val="superscript"/>
-              </w:rPr>
-              <w:t xml:space="preserve">[4]</w:t>
+              <w:t xml:space="preserve">Revenue contribution from support teams</w:t>
             </w:r>
           </w:p>
         </w:tc>
@@ -2042,7 +1937,7 @@
           <w:p>
             <w:pPr>
               <w:pStyle w:val="TableText"/>
-              <w:keepNext/>
+              <w:keepNext w:val="false"/>
             </w:pPr>
             <w:r>
               <w:rPr>
@@ -2052,7 +1947,7 @@
                 <w:sz w:val="24"/>
                 <w:szCs w:val="24"/>
               </w:rPr>
-              <w:t xml:space="preserve">28.16%</w:t>
+              <w:t xml:space="preserve">8%</w:t>
             </w:r>
           </w:p>
         </w:tc>
@@ -2069,102 +1964,10 @@
           <w:p>
             <w:pPr>
               <w:pStyle w:val="TableText"/>
-              <w:keepNext/>
-            </w:pPr>
-            <w:r>
-              <w:rPr>
-                <w:b/>
-                <w:bCs/>
-              </w:rPr>
-              <w:t xml:space="preserve">Scheduling and dispatch leads FSM investment.</w:t>
-            </w:r>
-          </w:p>
-          <w:p>
-            <w:pPr>
-              <w:pStyle w:val="TableText"/>
-              <w:keepNext/>
-            </w:pPr>
-            <w:r>
-              <w:t xml:space="preserve">Share of 2025 global field service management software revenue, the largest single category.</w:t>
-            </w:r>
-            <w:r>
-              <w:rPr>
-                <w:color w:val="576B7D"/>
-                <w:vertAlign w:val="superscript"/>
-              </w:rPr>
-              <w:t xml:space="preserve">[5]</w:t>
-            </w:r>
-          </w:p>
-        </w:tc>
-      </w:tr>
-      <w:tr>
-        <w:trPr>
-          <w:cantSplit/>
-        </w:trPr>
-        <w:tc>
-          <w:tcPr>
-            <w:tcW w:type="dxa" w:w="1700"/>
-            <w:tcMar>
-              <w:top w:type="dxa" w:w="80"/>
-              <w:left w:type="dxa" w:w="120"/>
-              <w:bottom w:type="dxa" w:w="80"/>
-              <w:right w:type="dxa" w:w="120"/>
-            </w:tcMar>
-          </w:tcPr>
-          <w:p>
-            <w:pPr>
-              <w:pStyle w:val="TableText"/>
               <w:keepNext w:val="false"/>
             </w:pPr>
             <w:r>
-              <w:rPr>
-                <w:b/>
-                <w:bCs/>
-                <w:color w:val="0E9488"/>
-                <w:sz w:val="24"/>
-                <w:szCs w:val="24"/>
-              </w:rPr>
-              <w:t xml:space="preserve">100%</w:t>
-            </w:r>
-          </w:p>
-        </w:tc>
-        <w:tc>
-          <w:tcPr>
-            <w:tcW w:type="dxa" w:w="8092"/>
-            <w:tcMar>
-              <w:top w:type="dxa" w:w="80"/>
-              <w:left w:type="dxa" w:w="120"/>
-              <w:bottom w:type="dxa" w:w="80"/>
-              <w:right w:type="dxa" w:w="120"/>
-            </w:tcMar>
-          </w:tcPr>
-          <w:p>
-            <w:pPr>
-              <w:pStyle w:val="TableText"/>
-              <w:keepNext/>
-            </w:pPr>
-            <w:r>
-              <w:rPr>
-                <w:b/>
-                <w:bCs/>
-              </w:rPr>
-              <w:t xml:space="preserve">UAE mobile connections run on broadband.</w:t>
-            </w:r>
-          </w:p>
-          <w:p>
-            <w:pPr>
-              <w:pStyle w:val="TableText"/>
-              <w:keepNext w:val="false"/>
-            </w:pPr>
-            <w:r>
-              <w:t xml:space="preserve">Share of the UAE's 21.9 million mobile connections classed as broadband (3G, 4G or 5G) in early 2025.</w:t>
-            </w:r>
-            <w:r>
-              <w:rPr>
-                <w:color w:val="576B7D"/>
-                <w:vertAlign w:val="superscript"/>
-              </w:rPr>
-              <w:t xml:space="preserve">[6]</w:t>
+              <w:t xml:space="preserve">Higher recurring revenue with ERP integration (Nucleus Research)</w:t>
             </w:r>
           </w:p>
         </w:tc>
@@ -2172,8 +1975,732 @@
     </w:tbl>
     <w:p>
       <w:pPr>
+        <w:pStyle w:val="Eyebrow"/>
+      </w:pPr>
+      <w:r>
+        <w:t xml:space="preserve">Get started</w:t>
+      </w:r>
+    </w:p>
+    <w:p>
+      <w:pPr>
+        <w:pStyle w:val="Heading2"/>
+        <w:keepNext/>
+        <w:keepLines/>
+      </w:pPr>
+      <w:r>
+        <w:t xml:space="preserve">See SugarAI running your own jobs, from service request to signed job sheet.</w:t>
+      </w:r>
+    </w:p>
+    <w:p>
+      <w:pPr>
+        <w:pStyle w:val="ButtonNote"/>
+      </w:pPr>
+      <w:r>
+        <w:rPr>
+          <w:b/>
+          <w:bCs/>
+        </w:rPr>
+        <w:t xml:space="preserve">Button: </w:t>
+      </w:r>
+      <w:r>
+        <w:t xml:space="preserve">Talk to our field service team</w:t>
+      </w:r>
+    </w:p>
+    <w:p>
+      <w:pPr>
+        <w:pStyle w:val="Eyebrow"/>
+      </w:pPr>
+      <w:r>
+        <w:t xml:space="preserve">Who we serve</w:t>
+      </w:r>
+    </w:p>
+    <w:p>
+      <w:pPr>
+        <w:pStyle w:val="Heading2"/>
+        <w:keepNext/>
+        <w:keepLines/>
+      </w:pPr>
+      <w:r>
+        <w:t xml:space="preserve">Field service businesses we configure SugarAI for</w:t>
+      </w:r>
+    </w:p>
+    <w:p>
+      <w:pPr>
+        <w:pStyle w:val="Lede"/>
+      </w:pPr>
+      <w:r>
+        <w:t xml:space="preserve">Each type of service operation gets its own SugarAI setup.</w:t>
+      </w:r>
+    </w:p>
+    <w:p>
+      <w:pPr>
+        <w:pStyle w:val="Heading4"/>
+        <w:keepNext/>
+        <w:keepLines/>
+      </w:pPr>
+      <w:r>
+        <w:t xml:space="preserve">Integrated facilities management providers</w:t>
+      </w:r>
+    </w:p>
+    <w:p>
+      <w:pPr>
+        <w:pStyle w:val="Body"/>
+      </w:pPr>
+      <w:r>
+        <w:t xml:space="preserve">Hard and soft services across property portfolios, with heavy helpdesk volumes.</w:t>
+      </w:r>
+    </w:p>
+    <w:p>
+      <w:pPr>
+        <w:pStyle w:val="Heading4"/>
+        <w:keepNext/>
+        <w:keepLines/>
+      </w:pPr>
+      <w:r>
+        <w:t xml:space="preserve">HVAC, MEP and building services contractors</w:t>
+      </w:r>
+    </w:p>
+    <w:p>
+      <w:pPr>
+        <w:pStyle w:val="Body"/>
+      </w:pPr>
+      <w:r>
+        <w:t xml:space="preserve">Breakdown call-outs and planned maintenance, with cooling uptime as the priority.</w:t>
+      </w:r>
+    </w:p>
+    <w:p>
+      <w:pPr>
+        <w:pStyle w:val="Heading4"/>
+        <w:keepNext/>
+        <w:keepLines/>
+      </w:pPr>
+      <w:r>
+        <w:t xml:space="preserve">Equipment manufacturers and distributors</w:t>
+      </w:r>
+    </w:p>
+    <w:p>
+      <w:pPr>
+        <w:pStyle w:val="Body"/>
+      </w:pPr>
+      <w:r>
+        <w:t xml:space="preserve">Installed-base service, warranty and commissioning, extending SugarAI for manufacturers into after-sales.</w:t>
+      </w:r>
+    </w:p>
+    <w:p>
+      <w:pPr>
+        <w:pStyle w:val="Heading4"/>
+        <w:keepNext/>
+        <w:keepLines/>
+      </w:pPr>
+      <w:r>
+        <w:t xml:space="preserve">Lift, fire and life safety, and security system maintainers</w:t>
+      </w:r>
+    </w:p>
+    <w:p>
+      <w:pPr>
+        <w:pStyle w:val="Body"/>
+      </w:pPr>
+      <w:r>
+        <w:t xml:space="preserve">Statutory inspections and certificates held against every site and system.</w:t>
+      </w:r>
+    </w:p>
+    <w:p>
+      <w:pPr>
+        <w:pStyle w:val="Heading4"/>
+        <w:keepNext/>
+        <w:keepLines/>
+      </w:pPr>
+      <w:r>
+        <w:t xml:space="preserve">Medical and laboratory equipment service teams</w:t>
+      </w:r>
+    </w:p>
+    <w:p>
+      <w:pPr>
+        <w:pStyle w:val="Body"/>
+      </w:pPr>
+      <w:r>
+        <w:t xml:space="preserve">Calibration schedules, uptime commitments and audit-ready service records.</w:t>
+      </w:r>
+    </w:p>
+    <w:p>
+      <w:pPr>
+        <w:pStyle w:val="Heading4"/>
+        <w:keepNext/>
+        <w:keepLines/>
+      </w:pPr>
+      <w:r>
+        <w:t xml:space="preserve">Energy, solar and utilities O&amp;M teams</w:t>
+      </w:r>
+    </w:p>
+    <w:p>
+      <w:pPr>
+        <w:pStyle w:val="Body"/>
+      </w:pPr>
+      <w:r>
+        <w:t xml:space="preserve">Remote, distributed assets, inspection rounds and performance-linked service agreements.</w:t>
+      </w:r>
+    </w:p>
+    <w:p>
+      <w:pPr>
+        <w:pStyle w:val="Eyebrow"/>
+      </w:pPr>
+      <w:r>
+        <w:t xml:space="preserve">Regional fit</w:t>
+      </w:r>
+    </w:p>
+    <w:p>
+      <w:pPr>
+        <w:pStyle w:val="Heading2"/>
+        <w:keepNext/>
+        <w:keepLines/>
+      </w:pPr>
+      <w:r>
+        <w:t xml:space="preserve">Set up for field work in the UAE and wider GCC</w:t>
+      </w:r>
+    </w:p>
+    <w:p>
+      <w:pPr>
+        <w:pStyle w:val="Lede"/>
+        <w:keepNext/>
+      </w:pPr>
+      <w:r>
+        <w:t xml:space="preserve">Field service management in the UAE means crews spanning several emirates, customers served in Arabic and English, and a summer cooling peak on top of contracted maintenance. HLB HAMT configures SugarAI around all of it.</w:t>
+      </w:r>
+    </w:p>
+    <w:p>
+      <w:pPr>
+        <w:pStyle w:val="ButtonNote"/>
+      </w:pPr>
+      <w:r>
+        <w:rPr>
+          <w:b/>
+          <w:bCs/>
+        </w:rPr>
+        <w:t xml:space="preserve">Button: </w:t>
+      </w:r>
+      <w:r>
+        <w:t xml:space="preserve">Talk to our field service team</w:t>
+      </w:r>
+    </w:p>
+    <w:p>
+      <w:pPr>
+        <w:pStyle w:val="Body"/>
+        <w:numPr>
+          <w:ilvl w:val="0"/>
+          <w:numId w:val="2"/>
+        </w:numPr>
+      </w:pPr>
+      <w:r>
+        <w:rPr>
+          <w:b/>
+          <w:bCs/>
+        </w:rPr>
+        <w:t xml:space="preserve">Bilingual job sheets and customer updates</w:t>
+      </w:r>
+      <w:r>
+        <w:br/>
+        <w:t xml:space="preserve">Screens, job reports and customer notifications in Arabic or English.</w:t>
+      </w:r>
+    </w:p>
+    <w:p>
+      <w:pPr>
+        <w:pStyle w:val="Body"/>
+        <w:numPr>
+          <w:ilvl w:val="0"/>
+          <w:numId w:val="2"/>
+        </w:numPr>
+      </w:pPr>
+      <w:r>
+        <w:rPr>
+          <w:b/>
+          <w:bCs/>
+        </w:rPr>
+        <w:t xml:space="preserve">WhatsApp appointment and arrival updates</w:t>
+      </w:r>
+      <w:r>
+        <w:br/>
+        <w:t xml:space="preserve">Booking, arrival and completion messages sent on WhatsApp and logged against the job.</w:t>
+      </w:r>
+    </w:p>
+    <w:p>
+      <w:pPr>
+        <w:pStyle w:val="Body"/>
+        <w:numPr>
+          <w:ilvl w:val="0"/>
+          <w:numId w:val="2"/>
+        </w:numPr>
+      </w:pPr>
+      <w:r>
+        <w:rPr>
+          <w:b/>
+          <w:bCs/>
+        </w:rPr>
+        <w:t xml:space="preserve">Multi-entity, multi-emirate operations</w:t>
+      </w:r>
+      <w:r>
+        <w:br/>
+        <w:t xml:space="preserve">Branches across emirates and the GCC keep their own crews but report as one group.</w:t>
+      </w:r>
+    </w:p>
+    <w:p>
+      <w:pPr>
+        <w:pStyle w:val="Body"/>
+        <w:numPr>
+          <w:ilvl w:val="0"/>
+          <w:numId w:val="2"/>
+        </w:numPr>
+      </w:pPr>
+      <w:r>
+        <w:rPr>
+          <w:b/>
+          <w:bCs/>
+        </w:rPr>
+        <w:t xml:space="preserve">Authority inspection tracking</w:t>
+      </w:r>
+      <w:r>
+        <w:br/>
+        <w:t xml:space="preserve">Civil defence and other authority inspections scheduled and evidenced per site.</w:t>
+      </w:r>
+    </w:p>
+    <w:p>
+      <w:pPr>
+        <w:pStyle w:val="Body"/>
+        <w:numPr>
+          <w:ilvl w:val="0"/>
+          <w:numId w:val="2"/>
+        </w:numPr>
+      </w:pPr>
+      <w:r>
+        <w:rPr>
+          <w:b/>
+          <w:bCs/>
+        </w:rPr>
+        <w:t xml:space="preserve">Summer peak capacity planning</w:t>
+      </w:r>
+      <w:r>
+        <w:br/>
+        <w:t xml:space="preserve">Job volumes, technician availability and subcontractor capacity planned before the cooling season.</w:t>
+      </w:r>
+    </w:p>
+    <w:p>
+      <w:pPr>
+        <w:pStyle w:val="Body"/>
+        <w:numPr>
+          <w:ilvl w:val="0"/>
+          <w:numId w:val="2"/>
+        </w:numPr>
+      </w:pPr>
+      <w:r>
+        <w:rPr>
+          <w:b/>
+          <w:bCs/>
+        </w:rPr>
+        <w:t xml:space="preserve">Cloud, private cloud or on-premise</w:t>
+      </w:r>
+      <w:r>
+        <w:br/>
+        <w:t xml:space="preserve">Each group entity can run on a different deployment mode.</w:t>
+      </w:r>
+    </w:p>
+    <w:p>
+      <w:pPr>
+        <w:pStyle w:val="Eyebrow"/>
+      </w:pPr>
+      <w:r>
+        <w:t xml:space="preserve">How we work</w:t>
+      </w:r>
+    </w:p>
+    <w:p>
+      <w:pPr>
+        <w:pStyle w:val="Heading2"/>
+        <w:keepNext/>
+        <w:keepLines/>
+      </w:pPr>
+      <w:r>
+        <w:t xml:space="preserve">How we roll out SugarAI CRM for field service teams</w:t>
+      </w:r>
+    </w:p>
+    <w:p>
+      <w:pPr>
+        <w:pStyle w:val="Lede"/>
+      </w:pPr>
+      <w:r>
+        <w:t xml:space="preserve">Each stage ends with your sign-off. The service desk goes live first; mobile job sheets and scheduling follow.</w:t>
+      </w:r>
+    </w:p>
+    <w:p>
+      <w:pPr>
+        <w:pStyle w:val="Heading4"/>
+        <w:keepNext/>
+        <w:keepLines/>
+      </w:pPr>
+      <w:r>
+        <w:t xml:space="preserve">Discovery</w:t>
+      </w:r>
+    </w:p>
+    <w:p>
+      <w:pPr>
+        <w:pStyle w:val="Body"/>
+      </w:pPr>
+      <w:r>
+        <w:t xml:space="preserve">Workshops follow a typical job end to end: call, visit, invoice and renewal.</w:t>
+      </w:r>
+    </w:p>
+    <w:p>
+      <w:pPr>
+        <w:pStyle w:val="Heading4"/>
+        <w:keepNext/>
+        <w:keepLines/>
+      </w:pPr>
+      <w:r>
+        <w:t xml:space="preserve">Solution design</w:t>
+      </w:r>
+    </w:p>
+    <w:p>
+      <w:pPr>
+        <w:pStyle w:val="Body"/>
+      </w:pPr>
+      <w:r>
+        <w:t xml:space="preserve">Job types, skills matrix, SLA, entitlement and assignment rules agreed in writing.</w:t>
+      </w:r>
+    </w:p>
+    <w:p>
+      <w:pPr>
+        <w:pStyle w:val="Heading4"/>
+        <w:keepNext/>
+        <w:keepLines/>
+      </w:pPr>
+      <w:r>
+        <w:t xml:space="preserve">Configure and build</w:t>
+      </w:r>
+    </w:p>
+    <w:p>
+      <w:pPr>
+        <w:pStyle w:val="Body"/>
+      </w:pPr>
+      <w:r>
+        <w:t xml:space="preserve">Consultants configure cases, work orders, job sheets, portals and ERP links.</w:t>
+      </w:r>
+    </w:p>
+    <w:p>
+      <w:pPr>
+        <w:pStyle w:val="Heading4"/>
+        <w:keepNext/>
+        <w:keepLines/>
+      </w:pPr>
+      <w:r>
+        <w:t xml:space="preserve">Data migration</w:t>
+      </w:r>
+    </w:p>
+    <w:p>
+      <w:pPr>
+        <w:pStyle w:val="Body"/>
+      </w:pPr>
+      <w:r>
+        <w:t xml:space="preserve">We trial-load customer, site, asset and contract records, removing duplicates before cutover.</w:t>
+      </w:r>
+    </w:p>
+    <w:p>
+      <w:pPr>
+        <w:pStyle w:val="Heading4"/>
+        <w:keepNext/>
+        <w:keepLines/>
+      </w:pPr>
+      <w:r>
+        <w:t xml:space="preserve">Test and train</w:t>
+      </w:r>
+    </w:p>
+    <w:p>
+      <w:pPr>
+        <w:pStyle w:val="Body"/>
+      </w:pPr>
+      <w:r>
+        <w:t xml:space="preserve">Acceptance tests signed off, then role-based training, on-device for technicians.</w:t>
+      </w:r>
+    </w:p>
+    <w:p>
+      <w:pPr>
+        <w:pStyle w:val="Heading4"/>
+        <w:keepNext/>
+        <w:keepLines/>
+      </w:pPr>
+      <w:r>
+        <w:t xml:space="preserve">Go-live and support</w:t>
+      </w:r>
+    </w:p>
+    <w:p>
+      <w:pPr>
+        <w:pStyle w:val="Body"/>
+      </w:pPr>
+      <w:r>
+        <w:t xml:space="preserve">Hypercare covers each launch phase; an SLA then governs managed support.</w:t>
+      </w:r>
+    </w:p>
+    <w:p>
+      <w:pPr>
+        <w:pStyle w:val="Heading4"/>
+        <w:keepNext/>
+        <w:pBdr>
+          <w:left w:val="single" w:color="0E9488" w:sz="18" w:space="8"/>
+        </w:pBdr>
+        <w:shd w:fill="EAF1F7" w:color="auto" w:val="clear"/>
+        <w:spacing w:after="0" w:before="240"/>
+      </w:pPr>
+      <w:r>
+        <w:t xml:space="preserve">Start with Guided Low-Touch onboarding, then add the field layer</w:t>
+      </w:r>
+    </w:p>
+    <w:p>
+      <w:pPr>
+        <w:pStyle w:val="Body"/>
+        <w:keepNext w:val="false"/>
+        <w:pBdr>
+          <w:left w:val="single" w:color="0E9488" w:sz="18" w:space="8"/>
+        </w:pBdr>
+        <w:shd w:fill="EAF1F7" w:color="auto" w:val="clear"/>
+        <w:spacing w:after="160" w:before="0"/>
+      </w:pPr>
+      <w:r>
+        <w:t xml:space="preserve">Guided Low-Touch onboarding gets a standard service desk (cases, SLAs, customer records) working quickly. Scheduling rules, mobile job sheets and ERP integration follow next.</w:t>
+      </w:r>
+    </w:p>
+    <w:p>
+      <w:pPr>
+        <w:pStyle w:val="Eyebrow"/>
+      </w:pPr>
+      <w:r>
+        <w:t xml:space="preserve">Why HLB HAMT</w:t>
+      </w:r>
+    </w:p>
+    <w:p>
+      <w:pPr>
+        <w:pStyle w:val="Heading2"/>
+        <w:keepNext/>
+        <w:keepLines/>
+      </w:pPr>
+      <w:r>
+        <w:t xml:space="preserve">Why service businesses choose HLB HAMT</w:t>
+      </w:r>
+    </w:p>
+    <w:p>
+      <w:pPr>
+        <w:pStyle w:val="Heading3"/>
+        <w:keepNext/>
+        <w:keepLines/>
+      </w:pPr>
+      <w:r>
+        <w:t xml:space="preserve">Regional delivery depth</w:t>
+      </w:r>
+    </w:p>
+    <w:p>
+      <w:pPr>
+        <w:pStyle w:val="Body"/>
+      </w:pPr>
+      <w:r>
+        <w:t xml:space="preserve">Gulf maintenance contracts have their own tendering, pricing and delivery conventions, which 26 years in the UAE and GCC have taught us.</w:t>
+      </w:r>
+    </w:p>
+    <w:p>
+      <w:pPr>
+        <w:pStyle w:val="Heading3"/>
+        <w:keepNext/>
+        <w:keepLines/>
+      </w:pPr>
+      <w:r>
+        <w:t xml:space="preserve">A field service blueprint to start from</w:t>
+      </w:r>
+    </w:p>
+    <w:p>
+      <w:pPr>
+        <w:pStyle w:val="Body"/>
+      </w:pPr>
+      <w:r>
+        <w:t xml:space="preserve">Job types, SLA rules, checklists and dashboards arrive preconfigured and are adapted to your contracts.</w:t>
+      </w:r>
+    </w:p>
+    <w:p>
+      <w:pPr>
+        <w:pStyle w:val="Heading3"/>
+        <w:keepNext/>
+        <w:keepLines/>
+      </w:pPr>
+      <w:r>
+        <w:t xml:space="preserve">One team from design to support</w:t>
+      </w:r>
+    </w:p>
+    <w:p>
+      <w:pPr>
+        <w:pStyle w:val="Body"/>
+      </w:pPr>
+      <w:r>
+        <w:t xml:space="preserve">No part of your project is subcontracted: our technology consulting services team designs, builds, integrates and supports it.</w:t>
+      </w:r>
+    </w:p>
+    <w:p>
+      <w:pPr>
+        <w:pStyle w:val="Heading3"/>
+        <w:keepNext/>
+        <w:keepLines/>
+      </w:pPr>
+      <w:r>
+        <w:t xml:space="preserve">Support after go-live</w:t>
+      </w:r>
+    </w:p>
+    <w:p>
+      <w:pPr>
+        <w:pStyle w:val="Body"/>
+      </w:pPr>
+      <w:r>
+        <w:t xml:space="preserve">Your build team stays on after launch under agreed service levels, and one named manager takes escalations.</w:t>
+      </w:r>
+    </w:p>
+    <w:p>
+      <w:pPr>
+        <w:pStyle w:val="Eyebrow"/>
+      </w:pPr>
+      <w:r>
+        <w:t xml:space="preserve">Common questions</w:t>
+      </w:r>
+    </w:p>
+    <w:p>
+      <w:pPr>
+        <w:pStyle w:val="Heading2"/>
+        <w:keepNext/>
+        <w:keepLines/>
+      </w:pPr>
+      <w:r>
+        <w:t xml:space="preserve">Questions field service teams ask us</w:t>
+      </w:r>
+    </w:p>
+    <w:p>
+      <w:pPr>
+        <w:pStyle w:val="Heading3"/>
+        <w:keepNext/>
+        <w:keepLines/>
+      </w:pPr>
+      <w:r>
+        <w:t xml:space="preserve">How does SugarAI share parts, pricing and invoice data with our ERP?</w:t>
+      </w:r>
+    </w:p>
+    <w:p>
+      <w:pPr>
+        <w:pStyle w:val="Body"/>
+      </w:pPr>
+      <w:r>
+        <w:t xml:space="preserve">Through integration. Your ERP owns stock, pricing and invoicing, while SugarAI, as your field service CRM software, pulls in parts and prices, then returns completed work orders for billing.</w:t>
+      </w:r>
+    </w:p>
+    <w:p>
+      <w:pPr>
+        <w:pStyle w:val="Heading3"/>
+        <w:keepNext/>
+        <w:keepLines/>
+      </w:pPr>
+      <w:r>
+        <w:t xml:space="preserve">How do technicians use SugarAI on site?</w:t>
+      </w:r>
+    </w:p>
+    <w:p>
+      <w:pPr>
+        <w:pStyle w:val="Body"/>
+      </w:pPr>
+      <w:r>
+        <w:t xml:space="preserve">Technicians work from their phone: the day's jobs, the site address for directions, the asset's history and a checklist that takes photos, readings and the customer's signature.</w:t>
+      </w:r>
+    </w:p>
+    <w:p>
+      <w:pPr>
+        <w:pStyle w:val="Heading3"/>
+        <w:keepNext/>
+        <w:keepLines/>
+      </w:pPr>
+      <w:r>
+        <w:t xml:space="preserve">How are SLAs and contract entitlements tracked?</w:t>
+      </w:r>
+    </w:p>
+    <w:p>
+      <w:pPr>
+        <w:pStyle w:val="Body"/>
+      </w:pPr>
+      <w:r>
+        <w:t xml:space="preserve">Response and resolution targets come from the customer's contract entitlements. Every work order runs its own SLA clock, with alerts before a breach and attainment reported per contract.</w:t>
+      </w:r>
+    </w:p>
+    <w:p>
+      <w:pPr>
+        <w:pStyle w:val="Heading3"/>
+        <w:keepNext/>
+        <w:keepLines/>
+      </w:pPr>
+      <w:r>
+        <w:t xml:space="preserve">Can we manage subcontractors alongside our own technicians?</w:t>
+      </w:r>
+    </w:p>
+    <w:p>
+      <w:pPr>
+        <w:pStyle w:val="Body"/>
+      </w:pPr>
+      <w:r>
+        <w:t xml:space="preserve">Yes. Each subcontractor has a record with skills and rates, closes jobs through a portal and follows your job sheet standard, so customers see one provider.</w:t>
+      </w:r>
+    </w:p>
+    <w:p>
+      <w:pPr>
+        <w:pStyle w:val="Heading3"/>
+        <w:keepNext/>
+        <w:keepLines/>
+      </w:pPr>
+      <w:r>
+        <w:t xml:space="preserve">What happens when a job cannot be fixed on the first visit?</w:t>
+      </w:r>
+    </w:p>
+    <w:p>
+      <w:pPr>
+        <w:pStyle w:val="Body"/>
+      </w:pPr>
+      <w:r>
+        <w:t xml:space="preserve">A linked follow-up work order opens, recording why: parts, access or skills. Parts requests go to stores or the ERP, and first-time fix reports show which assets need attention.</w:t>
+      </w:r>
+    </w:p>
+    <w:p>
+      <w:pPr>
+        <w:pStyle w:val="Heading3"/>
+        <w:keepNext/>
+        <w:keepLines/>
+      </w:pPr>
+      <w:r>
+        <w:t xml:space="preserve">Can SugarAI plan preventive maintenance as well as reactive call-outs?</w:t>
+      </w:r>
+    </w:p>
+    <w:p>
+      <w:pPr>
+        <w:pStyle w:val="Body"/>
+      </w:pPr>
+      <w:r>
+        <w:t xml:space="preserve">Yes. Preventive visits are generated from contract schedules and asset types, alongside reactive cases, so planners see both kinds of work in one place.</w:t>
+      </w:r>
+    </w:p>
+    <w:p>
+      <w:pPr>
+        <w:pStyle w:val="Heading3"/>
+        <w:keepNext/>
+        <w:keepLines/>
+      </w:pPr>
+      <w:r>
+        <w:t xml:space="preserve">We already run SugarCRM. Does SugarCRM field service management carry over to SugarAI?</w:t>
+      </w:r>
+    </w:p>
+    <w:p>
+      <w:pPr>
+        <w:pStyle w:val="Body"/>
+      </w:pPr>
+      <w:r>
+        <w:t xml:space="preserve">Yes. SugarCRM became SugarAI in April 2026, and existing instances keep running. We can add field service capabilities to yours, or audit and clean up an implementation that stalled.</w:t>
+      </w:r>
+    </w:p>
+    <w:p>
+      <w:pPr>
         <w:pStyle w:val="SourceHead"/>
-        <w:keepNext/>
       </w:pPr>
       <w:r>
         <w:t xml:space="preserve">Sources</w:t>
@@ -2188,856 +2715,9 @@
         </w:numPr>
       </w:pPr>
       <w:r>
-        <w:t xml:space="preserve">Aquant, 2025 Field Service Benchmark Report (press release): </w:t>
-      </w:r>
-      <w:hyperlink w:history="1" r:id="rIdt9thoq_bcvckregrkybtr">
-        <w:r>
-          <w:rPr>
-            <w:rStyle w:val="Hyperlink"/>
-          </w:rPr>
-          <w:t xml:space="preserve">https://www.globenewswire.com/news-release/2025/02/13/3026225/0/en/Aquant-s-2025-Field-Service-Benchmark-Report-Reveals-AI-Enabling-39-Faster-Machinery-Repairs-and-More.html</w:t>
-        </w:r>
-      </w:hyperlink>
-      <w:r>
-        <w:t xml:space="preserve"> (report: </w:t>
-      </w:r>
-      <w:hyperlink w:history="1" r:id="rIdew91k_xwnyljgpv1icuc9">
-        <w:r>
-          <w:rPr>
-            <w:rStyle w:val="Hyperlink"/>
-          </w:rPr>
-          <w:t xml:space="preserve">https://discover.aquant.ai/service-benchmark-report</w:t>
-        </w:r>
-      </w:hyperlink>
-      <w:r>
-        <w:t xml:space="preserve">)</w:t>
-      </w:r>
-    </w:p>
-    <w:p>
-      <w:pPr>
-        <w:pStyle w:val="SourceText"/>
-        <w:numPr>
-          <w:ilvl w:val="0"/>
-          <w:numId w:val="3"/>
-        </w:numPr>
-      </w:pPr>
-      <w:r>
-        <w:t xml:space="preserve">Mordor Intelligence, global field service management market (solution segment: scheduling, dispatch and route optimisation, 28.16% of 2025 revenue): </w:t>
-      </w:r>
-      <w:hyperlink w:history="1" r:id="rIdn4kn9d_ua1jcqk-b1se4x">
-        <w:r>
-          <w:rPr>
-            <w:rStyle w:val="Hyperlink"/>
-          </w:rPr>
-          <w:t xml:space="preserve">https://www.mordorintelligence.com/industry-reports/field-service-management-market</w:t>
-        </w:r>
-      </w:hyperlink>
-    </w:p>
-    <w:p>
-      <w:pPr>
-        <w:pStyle w:val="SourceText"/>
-        <w:numPr>
-          <w:ilvl w:val="0"/>
-          <w:numId w:val="3"/>
-        </w:numPr>
-      </w:pPr>
-      <w:r>
-        <w:t xml:space="preserve">DataReportal, Digital 2025: United Arab Emirates: </w:t>
-      </w:r>
-      <w:hyperlink w:history="1" r:id="rIdb0gqcjbzczqvguz0__q1a">
-        <w:r>
-          <w:rPr>
-            <w:rStyle w:val="Hyperlink"/>
-          </w:rPr>
-          <w:t xml:space="preserve">https://datareportal.com/reports/digital-2025-united-arab-emirates</w:t>
-        </w:r>
-      </w:hyperlink>
-    </w:p>
-    <w:p>
-      <w:pPr>
-        <w:pStyle w:val="Eyebrow"/>
-      </w:pPr>
-      <w:r>
-        <w:t xml:space="preserve">Get started</w:t>
-      </w:r>
-    </w:p>
-    <w:p>
-      <w:pPr>
-        <w:pStyle w:val="Heading2"/>
-        <w:keepNext/>
-        <w:keepLines/>
-      </w:pPr>
-      <w:r>
-        <w:t xml:space="preserve">See SugarAI running your own jobs, from service request to signed job sheet.</w:t>
-      </w:r>
-    </w:p>
-    <w:p>
-      <w:pPr>
-        <w:pStyle w:val="ButtonNote"/>
-      </w:pPr>
-      <w:r>
-        <w:rPr>
-          <w:b/>
-          <w:bCs/>
-        </w:rPr>
-        <w:t xml:space="preserve">Button: </w:t>
-      </w:r>
-      <w:r>
-        <w:t xml:space="preserve">Talk to our field service team</w:t>
-      </w:r>
-    </w:p>
-    <w:p>
-      <w:pPr>
-        <w:pStyle w:val="Eyebrow"/>
-      </w:pPr>
-      <w:r>
-        <w:t xml:space="preserve">Who we serve</w:t>
-      </w:r>
-    </w:p>
-    <w:p>
-      <w:pPr>
-        <w:pStyle w:val="Heading2"/>
-        <w:keepNext/>
-        <w:keepLines/>
-      </w:pPr>
-      <w:r>
-        <w:t xml:space="preserve">Field service businesses we configure SugarAI for</w:t>
-      </w:r>
-    </w:p>
-    <w:p>
-      <w:pPr>
-        <w:pStyle w:val="Lede"/>
-        <w:keepNext w:val="false"/>
-      </w:pPr>
-      <w:r>
-        <w:t xml:space="preserve">Each type of service operation gets its own SugarAI setup.</w:t>
-      </w:r>
-    </w:p>
-    <w:p>
-      <w:pPr>
-        <w:pStyle w:val="Heading4"/>
-        <w:keepNext/>
-        <w:keepLines/>
-      </w:pPr>
-      <w:r>
-        <w:t xml:space="preserve">Integrated facilities management providers</w:t>
-      </w:r>
-    </w:p>
-    <w:p>
-      <w:pPr>
-        <w:pStyle w:val="Body"/>
-      </w:pPr>
-      <w:r>
-        <w:t xml:space="preserve">Hard and soft services across property portfolios, with heavy helpdesk volumes.</w:t>
-      </w:r>
-    </w:p>
-    <w:p>
-      <w:pPr>
-        <w:pStyle w:val="Heading4"/>
-        <w:keepNext/>
-        <w:keepLines/>
-      </w:pPr>
-      <w:r>
-        <w:t xml:space="preserve">HVAC, MEP and building services contractors</w:t>
-      </w:r>
-    </w:p>
-    <w:p>
-      <w:pPr>
-        <w:pStyle w:val="Body"/>
-      </w:pPr>
-      <w:r>
-        <w:t xml:space="preserve">Breakdown call-outs and planned maintenance, with cooling uptime as the priority.</w:t>
-      </w:r>
-    </w:p>
-    <w:p>
-      <w:pPr>
-        <w:pStyle w:val="Heading4"/>
-        <w:keepNext/>
-        <w:keepLines/>
-      </w:pPr>
-      <w:r>
-        <w:t xml:space="preserve">Equipment manufacturers and distributors</w:t>
-      </w:r>
-    </w:p>
-    <w:p>
-      <w:pPr>
-        <w:pStyle w:val="Body"/>
-      </w:pPr>
-      <w:r>
-        <w:t xml:space="preserve">Installed-base service, warranty and commissioning, extending </w:t>
-      </w:r>
-      <w:r>
-        <w:rPr>
-          <w:color w:val="10538F"/>
-          <w:u w:val="single"/>
-        </w:rPr>
-        <w:t xml:space="preserve">SugarAI for manufacturers</w:t>
-      </w:r>
-      <w:r>
-        <w:t xml:space="preserve"> into after-sales.</w:t>
-      </w:r>
-    </w:p>
-    <w:p>
-      <w:pPr>
-        <w:pStyle w:val="Heading4"/>
-        <w:keepNext/>
-        <w:keepLines/>
-      </w:pPr>
-      <w:r>
-        <w:t xml:space="preserve">Lift, fire and life safety, and security system maintainers</w:t>
-      </w:r>
-    </w:p>
-    <w:p>
-      <w:pPr>
-        <w:pStyle w:val="Body"/>
-      </w:pPr>
-      <w:r>
-        <w:t xml:space="preserve">Statutory inspections and certificates held against every site and system.</w:t>
-      </w:r>
-    </w:p>
-    <w:p>
-      <w:pPr>
-        <w:pStyle w:val="Heading4"/>
-        <w:keepNext/>
-        <w:keepLines/>
-      </w:pPr>
-      <w:r>
-        <w:t xml:space="preserve">Medical and laboratory equipment service teams</w:t>
-      </w:r>
-    </w:p>
-    <w:p>
-      <w:pPr>
-        <w:pStyle w:val="Body"/>
-      </w:pPr>
-      <w:r>
-        <w:t xml:space="preserve">Calibration schedules, uptime commitments and audit-ready service records.</w:t>
-      </w:r>
-    </w:p>
-    <w:p>
-      <w:pPr>
-        <w:pStyle w:val="Heading4"/>
-        <w:keepNext/>
-        <w:keepLines/>
-      </w:pPr>
-      <w:r>
-        <w:t xml:space="preserve">Energy, solar and utilities O&amp;M teams</w:t>
-      </w:r>
-    </w:p>
-    <w:p>
-      <w:pPr>
-        <w:pStyle w:val="Body"/>
-      </w:pPr>
-      <w:r>
-        <w:t xml:space="preserve">Remote, distributed assets, inspection rounds and performance-linked service agreements.</w:t>
-      </w:r>
-    </w:p>
-    <w:p>
-      <w:pPr>
-        <w:pStyle w:val="Eyebrow"/>
-      </w:pPr>
-      <w:r>
-        <w:t xml:space="preserve">Regional fit</w:t>
-      </w:r>
-    </w:p>
-    <w:p>
-      <w:pPr>
-        <w:pStyle w:val="Heading2"/>
-        <w:keepNext/>
-        <w:keepLines/>
-      </w:pPr>
-      <w:r>
-        <w:t xml:space="preserve">Set up for field work in the UAE and wider GCC</w:t>
-      </w:r>
-    </w:p>
-    <w:p>
-      <w:pPr>
-        <w:pStyle w:val="Lede"/>
-        <w:keepNext w:val="false"/>
-      </w:pPr>
-      <w:r>
-        <w:t xml:space="preserve">Field service management in the UAE means crews spanning several emirates, customers served in Arabic and English, and a summer cooling peak on top of contracted maintenance. HLB HAMT configures SugarAI around all of it.</w:t>
-      </w:r>
-    </w:p>
-    <w:p>
-      <w:pPr>
-        <w:pStyle w:val="ButtonNote"/>
-      </w:pPr>
-      <w:r>
-        <w:rPr>
-          <w:b/>
-          <w:bCs/>
-        </w:rPr>
-        <w:t xml:space="preserve">Button: </w:t>
-      </w:r>
-      <w:r>
-        <w:t xml:space="preserve">Talk to our field service team</w:t>
-      </w:r>
-    </w:p>
-    <w:p>
-      <w:pPr>
-        <w:pStyle w:val="Body"/>
-        <w:numPr>
-          <w:ilvl w:val="0"/>
-          <w:numId w:val="4"/>
-        </w:numPr>
-      </w:pPr>
-      <w:r>
-        <w:rPr>
-          <w:b/>
-          <w:bCs/>
-        </w:rPr>
-        <w:t xml:space="preserve">Bilingual job sheets and customer updates</w:t>
-      </w:r>
-      <w:r>
-        <w:br/>
-        <w:t xml:space="preserve"/>
-      </w:r>
-      <w:r>
-        <w:t xml:space="preserve">Screens, job reports and customer notifications in Arabic or English.</w:t>
-      </w:r>
-    </w:p>
-    <w:p>
-      <w:pPr>
-        <w:pStyle w:val="Body"/>
-        <w:numPr>
-          <w:ilvl w:val="0"/>
-          <w:numId w:val="4"/>
-        </w:numPr>
-      </w:pPr>
-      <w:r>
-        <w:rPr>
-          <w:b/>
-          <w:bCs/>
-        </w:rPr>
-        <w:t xml:space="preserve">WhatsApp appointment and arrival updates</w:t>
-      </w:r>
-      <w:r>
-        <w:br/>
-        <w:t xml:space="preserve"/>
-      </w:r>
-      <w:r>
-        <w:t xml:space="preserve">Booking, arrival and completion messages sent on WhatsApp and logged against the job.</w:t>
-      </w:r>
-    </w:p>
-    <w:p>
-      <w:pPr>
-        <w:pStyle w:val="Body"/>
-        <w:numPr>
-          <w:ilvl w:val="0"/>
-          <w:numId w:val="4"/>
-        </w:numPr>
-      </w:pPr>
-      <w:r>
-        <w:rPr>
-          <w:b/>
-          <w:bCs/>
-        </w:rPr>
-        <w:t xml:space="preserve">Multi-entity, multi-emirate operations</w:t>
-      </w:r>
-      <w:r>
-        <w:br/>
-        <w:t xml:space="preserve"/>
-      </w:r>
-      <w:r>
-        <w:t xml:space="preserve">Branches across emirates and the GCC keep their own crews but report as one group.</w:t>
-      </w:r>
-    </w:p>
-    <w:p>
-      <w:pPr>
-        <w:pStyle w:val="Body"/>
-        <w:numPr>
-          <w:ilvl w:val="0"/>
-          <w:numId w:val="4"/>
-        </w:numPr>
-      </w:pPr>
-      <w:r>
-        <w:rPr>
-          <w:b/>
-          <w:bCs/>
-        </w:rPr>
-        <w:t xml:space="preserve">Authority inspection tracking</w:t>
-      </w:r>
-      <w:r>
-        <w:br/>
-        <w:t xml:space="preserve"/>
-      </w:r>
-      <w:r>
-        <w:t xml:space="preserve">Civil defence and other authority inspections scheduled and evidenced per site.</w:t>
-      </w:r>
-    </w:p>
-    <w:p>
-      <w:pPr>
-        <w:pStyle w:val="Body"/>
-        <w:numPr>
-          <w:ilvl w:val="0"/>
-          <w:numId w:val="4"/>
-        </w:numPr>
-      </w:pPr>
-      <w:r>
-        <w:rPr>
-          <w:b/>
-          <w:bCs/>
-        </w:rPr>
-        <w:t xml:space="preserve">Summer peak capacity planning</w:t>
-      </w:r>
-      <w:r>
-        <w:br/>
-        <w:t xml:space="preserve"/>
-      </w:r>
-      <w:r>
-        <w:t xml:space="preserve">Job volumes, technician availability and subcontractor capacity planned before the cooling season.</w:t>
-      </w:r>
-    </w:p>
-    <w:p>
-      <w:pPr>
-        <w:pStyle w:val="Body"/>
-        <w:numPr>
-          <w:ilvl w:val="0"/>
-          <w:numId w:val="4"/>
-        </w:numPr>
-      </w:pPr>
-      <w:r>
-        <w:rPr>
-          <w:b/>
-          <w:bCs/>
-        </w:rPr>
-        <w:t xml:space="preserve">Cloud, private cloud or on-premise</w:t>
-      </w:r>
-      <w:r>
-        <w:br/>
-        <w:t xml:space="preserve"/>
-      </w:r>
-      <w:r>
-        <w:t xml:space="preserve">Each group entity can run on a different deployment mode.</w:t>
-      </w:r>
-    </w:p>
-    <w:p>
-      <w:pPr>
-        <w:pStyle w:val="Eyebrow"/>
-      </w:pPr>
-      <w:r>
-        <w:t xml:space="preserve">How we work</w:t>
-      </w:r>
-    </w:p>
-    <w:p>
-      <w:pPr>
-        <w:pStyle w:val="Heading2"/>
-        <w:keepNext/>
-        <w:keepLines/>
-      </w:pPr>
-      <w:r>
-        <w:t xml:space="preserve">How we roll out SugarAI CRM for field service teams</w:t>
-      </w:r>
-    </w:p>
-    <w:p>
-      <w:pPr>
-        <w:pStyle w:val="Lede"/>
-        <w:keepNext w:val="false"/>
-      </w:pPr>
-      <w:r>
-        <w:t xml:space="preserve">Each stage ends with your sign-off. The service desk goes live first; mobile job sheets and scheduling follow.</w:t>
-      </w:r>
-    </w:p>
-    <w:p>
-      <w:pPr>
-        <w:pStyle w:val="Heading4"/>
-        <w:keepNext/>
-        <w:keepLines/>
-      </w:pPr>
-      <w:r>
-        <w:t xml:space="preserve">Discovery</w:t>
-      </w:r>
-    </w:p>
-    <w:p>
-      <w:pPr>
-        <w:pStyle w:val="Body"/>
-      </w:pPr>
-      <w:r>
-        <w:t xml:space="preserve">Workshops follow a typical job end to end: call, visit, invoice and renewal.</w:t>
-      </w:r>
-    </w:p>
-    <w:p>
-      <w:pPr>
-        <w:pStyle w:val="Heading4"/>
-        <w:keepNext/>
-        <w:keepLines/>
-      </w:pPr>
-      <w:r>
-        <w:t xml:space="preserve">Solution design</w:t>
-      </w:r>
-    </w:p>
-    <w:p>
-      <w:pPr>
-        <w:pStyle w:val="Body"/>
-      </w:pPr>
-      <w:r>
-        <w:t xml:space="preserve">Job types, skills matrix, SLA, entitlement and assignment rules agreed in writing.</w:t>
-      </w:r>
-    </w:p>
-    <w:p>
-      <w:pPr>
-        <w:pStyle w:val="Heading4"/>
-        <w:keepNext/>
-        <w:keepLines/>
-      </w:pPr>
-      <w:r>
-        <w:t xml:space="preserve">Configure and build</w:t>
-      </w:r>
-    </w:p>
-    <w:p>
-      <w:pPr>
-        <w:pStyle w:val="Body"/>
-      </w:pPr>
-      <w:r>
-        <w:t xml:space="preserve">Consultants configure cases, work orders, job sheets, portals and ERP links.</w:t>
-      </w:r>
-    </w:p>
-    <w:p>
-      <w:pPr>
-        <w:pStyle w:val="Heading4"/>
-        <w:keepNext/>
-        <w:keepLines/>
-      </w:pPr>
-      <w:r>
-        <w:t xml:space="preserve">Data migration</w:t>
-      </w:r>
-    </w:p>
-    <w:p>
-      <w:pPr>
-        <w:pStyle w:val="Body"/>
-      </w:pPr>
-      <w:r>
-        <w:t xml:space="preserve">We trial-load customer, site, asset and contract records, removing duplicates before cutover.</w:t>
-      </w:r>
-    </w:p>
-    <w:p>
-      <w:pPr>
-        <w:pStyle w:val="Heading4"/>
-        <w:keepNext/>
-        <w:keepLines/>
-      </w:pPr>
-      <w:r>
-        <w:t xml:space="preserve">Test and train</w:t>
-      </w:r>
-    </w:p>
-    <w:p>
-      <w:pPr>
-        <w:pStyle w:val="Body"/>
-      </w:pPr>
-      <w:r>
-        <w:t xml:space="preserve">Acceptance tests signed off, then role-based training, on-device for technicians.</w:t>
-      </w:r>
-    </w:p>
-    <w:p>
-      <w:pPr>
-        <w:pStyle w:val="Heading4"/>
-        <w:keepNext/>
-        <w:keepLines/>
-      </w:pPr>
-      <w:r>
-        <w:t xml:space="preserve">Go-live and support</w:t>
-      </w:r>
-    </w:p>
-    <w:p>
-      <w:pPr>
-        <w:pStyle w:val="Body"/>
-      </w:pPr>
-      <w:r>
-        <w:t xml:space="preserve">Hypercare covers each launch phase; an SLA then governs managed support.</w:t>
-      </w:r>
-    </w:p>
-    <w:p>
-      <w:pPr>
-        <w:pStyle w:val="Heading4"/>
-        <w:keepNext/>
-        <w:pBdr>
-          <w:left w:val="single" w:color="0E9488" w:sz="18" w:space="8"/>
-        </w:pBdr>
-        <w:shd w:fill="EAF1F7" w:color="auto" w:val="clear"/>
-        <w:spacing w:after="0" w:before="240"/>
-      </w:pPr>
-      <w:r>
-        <w:t xml:space="preserve">Start with Guided Low-Touch onboarding, then add the field layer</w:t>
-      </w:r>
-    </w:p>
-    <w:p>
-      <w:pPr>
-        <w:pStyle w:val="Body"/>
-        <w:pBdr>
-          <w:left w:val="single" w:color="0E9488" w:sz="18" w:space="8"/>
-        </w:pBdr>
-        <w:shd w:fill="EAF1F7" w:color="auto" w:val="clear"/>
-        <w:spacing w:after="160" w:before="0"/>
-      </w:pPr>
-      <w:r>
-        <w:t xml:space="preserve">Guided Low-Touch onboarding gets a standard service desk (cases, SLAs, customer records) working quickly. Scheduling rules, mobile job sheets and ERP integration follow next.</w:t>
-      </w:r>
-    </w:p>
-    <w:p>
-      <w:pPr>
-        <w:pStyle w:val="Eyebrow"/>
-      </w:pPr>
-      <w:r>
-        <w:t xml:space="preserve">Why HLB HAMT</w:t>
-      </w:r>
-    </w:p>
-    <w:p>
-      <w:pPr>
-        <w:pStyle w:val="Heading2"/>
-        <w:keepNext/>
-        <w:keepLines/>
-      </w:pPr>
-      <w:r>
-        <w:t xml:space="preserve">Why service businesses choose HLB HAMT</w:t>
-      </w:r>
-    </w:p>
-    <w:p>
-      <w:pPr>
-        <w:pStyle w:val="Heading3"/>
-        <w:keepNext/>
-        <w:keepLines/>
-      </w:pPr>
-      <w:r>
-        <w:t xml:space="preserve">Regional delivery depth</w:t>
-      </w:r>
-    </w:p>
-    <w:p>
-      <w:pPr>
-        <w:pStyle w:val="Body"/>
-      </w:pPr>
-      <w:r>
-        <w:t xml:space="preserve">Gulf maintenance contracts have their own tendering, pricing and delivery conventions, which 26 years in the UAE and GCC have taught us.</w:t>
-      </w:r>
-    </w:p>
-    <w:p>
-      <w:pPr>
-        <w:pStyle w:val="Heading3"/>
-        <w:keepNext/>
-        <w:keepLines/>
-      </w:pPr>
-      <w:r>
-        <w:t xml:space="preserve">A field service blueprint to start from</w:t>
-      </w:r>
-    </w:p>
-    <w:p>
-      <w:pPr>
-        <w:pStyle w:val="Body"/>
-      </w:pPr>
-      <w:r>
-        <w:t xml:space="preserve">Job types, SLA rules, checklists and dashboards arrive preconfigured and are adapted to your contracts.</w:t>
-      </w:r>
-    </w:p>
-    <w:p>
-      <w:pPr>
-        <w:pStyle w:val="Heading3"/>
-        <w:keepNext/>
-        <w:keepLines/>
-      </w:pPr>
-      <w:r>
-        <w:t xml:space="preserve">One team from design to support</w:t>
-      </w:r>
-    </w:p>
-    <w:p>
-      <w:pPr>
-        <w:pStyle w:val="Body"/>
-      </w:pPr>
-      <w:r>
-        <w:t xml:space="preserve">No part of your project is subcontracted: our </w:t>
-      </w:r>
-      <w:r>
-        <w:rPr>
-          <w:color w:val="10538F"/>
-          <w:u w:val="single"/>
-        </w:rPr>
-        <w:t xml:space="preserve">technology consulting services</w:t>
-      </w:r>
-      <w:r>
-        <w:t xml:space="preserve"> team designs, builds, integrates and supports it.</w:t>
-      </w:r>
-    </w:p>
-    <w:p>
-      <w:pPr>
-        <w:pStyle w:val="Heading3"/>
-        <w:keepNext/>
-        <w:keepLines/>
-      </w:pPr>
-      <w:r>
-        <w:t xml:space="preserve">Support after go-live</w:t>
-      </w:r>
-    </w:p>
-    <w:p>
-      <w:pPr>
-        <w:pStyle w:val="Body"/>
-      </w:pPr>
-      <w:r>
-        <w:t xml:space="preserve">Your build team stays on after launch under agreed service levels, and one named manager takes escalations.</w:t>
-      </w:r>
-    </w:p>
-    <w:p>
-      <w:pPr>
-        <w:pStyle w:val="Eyebrow"/>
-      </w:pPr>
-      <w:r>
-        <w:t xml:space="preserve">Common questions</w:t>
-      </w:r>
-    </w:p>
-    <w:p>
-      <w:pPr>
-        <w:pStyle w:val="Heading2"/>
-        <w:keepNext/>
-        <w:keepLines/>
-      </w:pPr>
-      <w:r>
-        <w:t xml:space="preserve">Questions field service teams ask us</w:t>
-      </w:r>
-    </w:p>
-    <w:p>
-      <w:pPr>
-        <w:pStyle w:val="Heading3"/>
-        <w:keepNext/>
-        <w:keepLines/>
-      </w:pPr>
-      <w:r>
-        <w:t xml:space="preserve">How does SugarAI share parts, pricing and invoice data with our ERP?</w:t>
-      </w:r>
-    </w:p>
-    <w:p>
-      <w:pPr>
-        <w:pStyle w:val="Body"/>
-      </w:pPr>
-      <w:r>
-        <w:t xml:space="preserve">Through integration. Your ERP owns stock, pricing and invoicing, while SugarAI, as your field service CRM software, pulls in parts and prices, then returns completed work orders for billing.</w:t>
-      </w:r>
-    </w:p>
-    <w:p>
-      <w:pPr>
-        <w:pStyle w:val="Heading3"/>
-        <w:keepNext/>
-        <w:keepLines/>
-      </w:pPr>
-      <w:r>
-        <w:t xml:space="preserve">How do technicians use SugarAI on site?</w:t>
-      </w:r>
-    </w:p>
-    <w:p>
-      <w:pPr>
-        <w:pStyle w:val="Body"/>
-      </w:pPr>
-      <w:r>
-        <w:t xml:space="preserve">Technicians work from their phone: the day's jobs, the site address for directions, the asset's history and a checklist that takes photos, readings and the customer's signature.</w:t>
-      </w:r>
-    </w:p>
-    <w:p>
-      <w:pPr>
-        <w:pStyle w:val="Heading3"/>
-        <w:keepNext/>
-        <w:keepLines/>
-      </w:pPr>
-      <w:r>
-        <w:t xml:space="preserve">How are SLAs and contract entitlements tracked?</w:t>
-      </w:r>
-    </w:p>
-    <w:p>
-      <w:pPr>
-        <w:pStyle w:val="Body"/>
-      </w:pPr>
-      <w:r>
-        <w:t xml:space="preserve">Response and resolution targets come from the customer's contract entitlements. Every work order runs its own SLA clock, with alerts before a breach and attainment reported per contract.</w:t>
-      </w:r>
-    </w:p>
-    <w:p>
-      <w:pPr>
-        <w:pStyle w:val="Heading3"/>
-        <w:keepNext/>
-        <w:keepLines/>
-      </w:pPr>
-      <w:r>
-        <w:t xml:space="preserve">Can we manage subcontractors alongside our own technicians?</w:t>
-      </w:r>
-    </w:p>
-    <w:p>
-      <w:pPr>
-        <w:pStyle w:val="Body"/>
-      </w:pPr>
-      <w:r>
-        <w:t xml:space="preserve">Yes. Each subcontractor has a record with skills and rates, closes jobs through a portal and follows your job sheet standard, so customers see one provider.</w:t>
-      </w:r>
-    </w:p>
-    <w:p>
-      <w:pPr>
-        <w:pStyle w:val="Heading3"/>
-        <w:keepNext/>
-        <w:keepLines/>
-      </w:pPr>
-      <w:r>
-        <w:t xml:space="preserve">What happens when a job cannot be fixed on the first visit?</w:t>
-      </w:r>
-    </w:p>
-    <w:p>
-      <w:pPr>
-        <w:pStyle w:val="Body"/>
-      </w:pPr>
-      <w:r>
-        <w:t xml:space="preserve">A linked follow-up work order opens, recording why: parts, access or skills. Parts requests go to stores or the ERP, and first-time fix reports show which assets need attention.</w:t>
-      </w:r>
-    </w:p>
-    <w:p>
-      <w:pPr>
-        <w:pStyle w:val="Heading3"/>
-        <w:keepNext/>
-        <w:keepLines/>
-      </w:pPr>
-      <w:r>
-        <w:t xml:space="preserve">Can SugarAI plan preventive maintenance as well as reactive call-outs?</w:t>
-      </w:r>
-    </w:p>
-    <w:p>
-      <w:pPr>
-        <w:pStyle w:val="Body"/>
-      </w:pPr>
-      <w:r>
-        <w:t xml:space="preserve">Yes. Preventive visits are generated from contract schedules and asset types, alongside reactive cases, so planners see both kinds of work in one place.</w:t>
-      </w:r>
-    </w:p>
-    <w:p>
-      <w:pPr>
-        <w:pStyle w:val="Heading3"/>
-        <w:keepNext/>
-        <w:keepLines/>
-      </w:pPr>
-      <w:r>
-        <w:t xml:space="preserve">We already run SugarCRM. Does SugarCRM field service management carry over to SugarAI?</w:t>
-      </w:r>
-    </w:p>
-    <w:p>
-      <w:pPr>
-        <w:pStyle w:val="Body"/>
-      </w:pPr>
-      <w:r>
-        <w:t xml:space="preserve">Yes. SugarCRM became SugarAI in April 2026, and existing instances keep running. We can add field service capabilities to yours, or audit and clean up an implementation that stalled.</w:t>
-      </w:r>
-    </w:p>
-    <w:p>
-      <w:pPr>
-        <w:pStyle w:val="SourceHead"/>
-        <w:keepNext/>
-      </w:pPr>
-      <w:r>
-        <w:t xml:space="preserve">Sources</w:t>
-      </w:r>
-    </w:p>
-    <w:p>
-      <w:pPr>
-        <w:pStyle w:val="SourceText"/>
-        <w:numPr>
-          <w:ilvl w:val="0"/>
-          <w:numId w:val="5"/>
-        </w:numPr>
-      </w:pPr>
-      <w:r>
         <w:t xml:space="preserve">Non-stat fact stated in FAQ 7 (SugarCRM rebranded as SugarAI, April 2026): </w:t>
       </w:r>
-      <w:hyperlink w:history="1" r:id="rIdnns_sdybig6s6pdfpexsi">
+      <w:hyperlink w:history="1" r:id="rIdppy0zsmvlmtirhh-y2m_e">
         <w:r>
           <w:rPr>
             <w:rStyle w:val="Hyperlink"/>
@@ -3067,6 +2747,7 @@
     <w:p>
       <w:pPr>
         <w:pStyle w:val="ButtonNote"/>
+        <w:keepNext/>
       </w:pPr>
       <w:r>
         <w:rPr>
@@ -3092,9 +2773,10 @@
     <w:p>
       <w:pPr>
         <w:pStyle w:val="Body"/>
+        <w:keepNext/>
         <w:numPr>
           <w:ilvl w:val="0"/>
-          <w:numId w:val="6"/>
+          <w:numId w:val="4"/>
         </w:numPr>
       </w:pPr>
       <w:r>
@@ -3104,9 +2786,10 @@
     <w:p>
       <w:pPr>
         <w:pStyle w:val="Body"/>
+        <w:keepNext/>
         <w:numPr>
           <w:ilvl w:val="0"/>
-          <w:numId w:val="6"/>
+          <w:numId w:val="4"/>
         </w:numPr>
       </w:pPr>
       <w:r>
@@ -3116,9 +2799,10 @@
     <w:p>
       <w:pPr>
         <w:pStyle w:val="Body"/>
+        <w:keepNext w:val="false"/>
         <w:numPr>
           <w:ilvl w:val="0"/>
-          <w:numId w:val="6"/>
+          <w:numId w:val="4"/>
         </w:numPr>
       </w:pPr>
       <w:r>
@@ -3128,7 +2812,7 @@
     <w:sectPr>
       <w:footerReference w:type="default" r:id="rId7"/>
       <w:pgSz w:w="12240" w:h="15840" w:orient="portrait"/>
-      <w:pgMar w:top="1080" w:right="1224" w:bottom="1080" w:left="1224" w:header="720" w:footer="720" w:gutter="0"/>
+      <w:pgMar w:top="1080" w:right="1224" w:bottom="1080" w:left="1224" w:header="708" w:footer="708" w:gutter="0"/>
       <w:pgNumType/>
       <w:docGrid w:linePitch="360"/>
     </w:sectPr>
@@ -3333,39 +3017,18 @@
     <w:multiLevelType w:val="hybridMultilevel"/>
     <w:lvl w:ilvl="0" w15:tentative="1">
       <w:start w:val="1"/>
-      <w:numFmt w:val="decimal"/>
-      <w:lvlText w:val="%1."/>
+      <w:numFmt w:val="bullet"/>
+      <w:lvlText w:val="■"/>
       <w:lvlJc w:val="left"/>
       <w:pPr>
         <w:ind w:left="360" w:hanging="360"/>
       </w:pPr>
+      <w:rPr>
+        <w:color w:val="0E9488"/>
+      </w:rPr>
     </w:lvl>
   </w:abstractNum>
   <w:abstractNum w:abstractNumId="3" w15:restartNumberingAfterBreak="0">
-    <w:multiLevelType w:val="hybridMultilevel"/>
-    <w:lvl w:ilvl="0" w15:tentative="1">
-      <w:start w:val="4"/>
-      <w:numFmt w:val="decimal"/>
-      <w:lvlText w:val="%1."/>
-      <w:lvlJc w:val="left"/>
-      <w:pPr>
-        <w:ind w:left="360" w:hanging="360"/>
-      </w:pPr>
-    </w:lvl>
-  </w:abstractNum>
-  <w:abstractNum w:abstractNumId="4" w15:restartNumberingAfterBreak="0">
-    <w:multiLevelType w:val="hybridMultilevel"/>
-    <w:lvl w:ilvl="0" w15:tentative="1">
-      <w:start w:val="7"/>
-      <w:numFmt w:val="decimal"/>
-      <w:lvlText w:val="%1."/>
-      <w:lvlJc w:val="left"/>
-      <w:pPr>
-        <w:ind w:left="360" w:hanging="360"/>
-      </w:pPr>
-    </w:lvl>
-  </w:abstractNum>
-  <w:abstractNum w:abstractNumId="5" w15:restartNumberingAfterBreak="0">
     <w:multiLevelType w:val="hybridMultilevel"/>
     <w:lvl w:ilvl="0" w15:tentative="1">
       <w:start w:val="1"/>
@@ -3377,19 +3040,16 @@
       </w:pPr>
     </w:lvl>
   </w:abstractNum>
-  <w:abstractNum w:abstractNumId="6" w15:restartNumberingAfterBreak="0">
+  <w:abstractNum w:abstractNumId="4" w15:restartNumberingAfterBreak="0">
     <w:multiLevelType w:val="hybridMultilevel"/>
     <w:lvl w:ilvl="0" w15:tentative="1">
       <w:start w:val="1"/>
-      <w:numFmt w:val="bullet"/>
-      <w:lvlText w:val="■"/>
+      <w:numFmt w:val="decimal"/>
+      <w:lvlText w:val="%1."/>
       <w:lvlJc w:val="left"/>
       <w:pPr>
         <w:ind w:left="360" w:hanging="360"/>
       </w:pPr>
-      <w:rPr>
-        <w:color w:val="0E9488"/>
-      </w:rPr>
     </w:lvl>
   </w:abstractNum>
   <w:num w:numId="1">
@@ -3405,25 +3065,13 @@
     </w:lvlOverride>
   </w:num>
   <w:num w:numId="3">
-    <w:abstractNumId w:val="3"/>
-    <w:lvlOverride w:ilvl="0">
-      <w:startOverride w:val="4"/>
-    </w:lvlOverride>
-  </w:num>
-  <w:num w:numId="4">
-    <w:abstractNumId w:val="6"/>
+    <w:abstractNumId w:val="4"/>
     <w:lvlOverride w:ilvl="0">
       <w:startOverride w:val="1"/>
     </w:lvlOverride>
   </w:num>
-  <w:num w:numId="5">
-    <w:abstractNumId w:val="4"/>
-    <w:lvlOverride w:ilvl="0">
-      <w:startOverride w:val="7"/>
-    </w:lvlOverride>
-  </w:num>
-  <w:num w:numId="6">
-    <w:abstractNumId w:val="5"/>
+  <w:num w:numId="4">
+    <w:abstractNumId w:val="3"/>
     <w:lvlOverride w:ilvl="0">
       <w:startOverride w:val="1"/>
     </w:lvlOverride>
@@ -3830,6 +3478,7 @@
     <w:basedOn w:val="Normal"/>
     <w:next w:val="Normal"/>
     <w:pPr>
+      <w:keepNext/>
       <w:spacing w:after="40" w:before="160"/>
     </w:pPr>
     <w:rPr>

</xml_diff>